<commit_message>
Rewrite the report's prose in a plainer voice
Same structure, same figures, same screenshots: every section's
body text reworded to read less uniformly, with shorter sentences,
fewer em-dashes and less rhetorical symmetry. Re-exported the Word
and PDF copies from the rewritten document.

Co-Authored-By: Claude Opus 5 <noreply@anthropic.com>
Claude-Session: https://claude.ai/code/session_01NRY1okTtnhtwbGo8bRvGeb
</commit_message>
<xml_diff>
--- a/docs/TenantPro Architecture, Implementation and Current State.docx
+++ b/docs/TenantPro Architecture, Implementation and Current State.docx
@@ -25,7 +25,7 @@
     <w:p>
       <w:pPr/>
       <w:r>
-        <w:t xml:space="preserve">A technical report on TenantPro, a two-sided rent-management system for the Indian residential rental market, covering its architecture, implemented feature set, payment model, security design, verification results and remaining scope.</w:t>
+        <w:t xml:space="preserve">A technical report on TenantPro, a two-sided rent-management system built for the Indian residential rental market. It covers the architecture, the features that are actually built, the payment model, the security design, what the tests prove, and what is still missing.</w:t>
       </w:r>
     </w:p>
     <w:p>
@@ -39,13 +39,13 @@
     <w:p>
       <w:pPr/>
       <w:r>
-        <w:t xml:space="preserve">TenantPro is a working two-sided rent-management system, deployed and in use, comprising a React Native client (Expo SDK 54) and a Node/Express API over MySQL. It spans 38,251 lines across 123 source files: 14,444 in the backend, 21,609 in the redesigned mobile client, and 2,198 in eight test suites. The API exposes 87 endpoints over 22 tables; the client has 28 screens.</w:t>
-      </w:r>
-    </w:p>
-    <w:p>
-      <w:pPr/>
-      <w:r>
-        <w:t xml:space="preserve">The system's defining design decision is that </w:t>
+        <w:t xml:space="preserve">TenantPro is a working rent-management system with two sides to it, already deployed and in use. The client is React Native on Expo SDK 54; the server is Node and Express over MySQL. Together they come to 38,251 lines across 123 source files: 14,444 in the backend, 21,609 in the redesigned mobile client and 2,198 in eight test suites. The API exposes 87 endpoints over 22 tables. The client has 28 screens.</w:t>
+      </w:r>
+    </w:p>
+    <w:p>
+      <w:pPr/>
+      <w:r>
+        <w:t xml:space="preserve">The one decision that shapes everything else is that </w:t>
       </w:r>
       <w:r>
         <w:rPr>
@@ -55,19 +55,19 @@
         <w:t xml:space="preserve">money never passes through it</w:t>
       </w:r>
       <w:r>
-        <w:t xml:space="preserve">. Rent moves from tenant to landlord directly — by UPI, or through a payment gateway connected to the landlord's own merchant account. This keeps the operator outside the RBI payment-aggregator perimeter, which requires authorisation and a ₹25 crore net-worth floor, and means the platform bills nobody and holds nobody's funds.</w:t>
-      </w:r>
-    </w:p>
-    <w:p>
-      <w:pPr/>
-      <w:r>
-        <w:t xml:space="preserve">Because the application cannot observe money it does not touch, it is built on an explicit confirmation model: a payment is real only once something other than the tenant vouches for it. Two vouchers exist — the landlord tapping Confirm, and a payment gateway asked directly, server-to-server. Both settle through one function, so they cannot disagree about when a rent cycle clears.</w:t>
-      </w:r>
-    </w:p>
-    <w:p>
-      <w:pPr/>
-      <w:r>
-        <w:t xml:space="preserve">The current build is verified by 386 assertions across six suites, including 168 driven end-to-end against a live server and a real MySQL instance, and 71 driving the compiled application in a browser engine. This report documents the architecture, the implemented feature set with interface evidence, the payment and session-security models, the verification methodology, and the work identified but not built.</w:t>
+        <w:t xml:space="preserve">. Rent goes straight from tenant to landlord, either by UPI or through a payment gateway wired to the landlord's own merchant account. That keeps the operator outside the RBI's payment-aggregator perimeter, which comes with an authorisation requirement and a ₹25 crore net-worth floor. It also means the platform bills nobody and holds nobody's funds.</w:t>
+      </w:r>
+    </w:p>
+    <w:p>
+      <w:pPr/>
+      <w:r>
+        <w:t xml:space="preserve">An application that does not touch the money also cannot see it, so everything rests on an explicit confirmation step. A payment counts as real only once somebody other than the tenant vouches for it. There are two such vouchers: the landlord tapping Confirm, and the payment gateway answering a server-to-server query. Both run through the same settlement function, which is why they can never disagree about when a rent cycle has cleared.</w:t>
+      </w:r>
+    </w:p>
+    <w:p>
+      <w:pPr/>
+      <w:r>
+        <w:t xml:space="preserve">The current build carries 386 assertions across six suites. Of those, 168 run end-to-end against a live server and a real MySQL instance, and 71 drive the compiled application inside a browser engine. The sections that follow cover the architecture, the feature set as it stands with screenshots as evidence, the payment and session-security models, how the verification was done, and the work that has been identified but not built.</w:t>
       </w:r>
     </w:p>
     <w:p>
@@ -81,19 +81,19 @@
     <w:p>
       <w:pPr/>
       <w:r>
-        <w:t xml:space="preserve">Indian residential tenancy is largely administered on paper, in WhatsApp threads, and in the landlord's memory. Rent is collected by UPI transfer or cash; the record of it is a screenshot. A tenant who has paid has no receipt the landlord acknowledges, and a landlord with several rooms has no reliable view of who is overdue.</w:t>
-      </w:r>
-    </w:p>
-    <w:p>
-      <w:pPr/>
-      <w:r>
-        <w:t xml:space="preserve">TenantPro addresses the operational layer of that relationship rather than the legal one. It gives a landlord a roster of properties, rooms and tenants with due dates derived from each tenancy's own anniversary, and gives the tenant a parallel view of the same records — what they owe, when, what they have paid, and what their landlord has acknowledged.</w:t>
-      </w:r>
-    </w:p>
-    <w:p>
-      <w:pPr/>
-      <w:r>
-        <w:t xml:space="preserve">Three constraints shaped the implementation more than any feature request.</w:t>
+        <w:t xml:space="preserve">Most residential tenancy in India is run on paper, in WhatsApp threads and in the landlord's memory. Rent arrives by UPI transfer or in cash, and the record of it is a screenshot. The tenant who paid has no receipt their landlord has acknowledged. The landlord with six rooms has no dependable way of telling who is behind.</w:t>
+      </w:r>
+    </w:p>
+    <w:p>
+      <w:pPr/>
+      <w:r>
+        <w:t xml:space="preserve">TenantPro works on the day-to-day side of that relationship, not the legal side. A landlord gets a roster of properties, rooms and tenants, with due dates worked out from each tenancy's own anniversary. The tenant gets a view of the same records from the other direction: what they owe, when it is due, what they have already paid, and which of it the landlord has acknowledged.</w:t>
+      </w:r>
+    </w:p>
+    <w:p>
+      <w:pPr/>
+      <w:r>
+        <w:t xml:space="preserve">Three constraints did more to shape the build than any feature request did.</w:t>
       </w:r>
     </w:p>
     <w:p>
@@ -112,7 +112,7 @@
         <w:t xml:space="preserve">The application cannot see money.</w:t>
       </w:r>
       <w:r>
-        <w:t xml:space="preserve"> It has no view of a bank account, so it cannot assert that a transfer occurred. Every payment is therefore a </w:t>
+        <w:t xml:space="preserve"> There is no view of a bank account anywhere in it, so it is in no position to assert that a transfer happened. Until something outside the app vouches for it, a payment is only a </w:t>
       </w:r>
       <w:r>
         <w:rPr>
@@ -122,7 +122,7 @@
         <w:t xml:space="preserve">claim</w:t>
       </w:r>
       <w:r>
-        <w:t xml:space="preserve"> until something external vouches for it. This is a correctness constraint, not a limitation to be engineered away.</w:t>
+        <w:t xml:space="preserve">. That is a matter of correctness, and no amount of engineering makes it go away.</w:t>
       </w:r>
     </w:p>
     <w:p>
@@ -141,7 +141,7 @@
         <w:t xml:space="preserve">Collecting rent centrally is a regulated activity.</w:t>
       </w:r>
       <w:r>
-        <w:t xml:space="preserve"> Pooling tenants' rent into one account and paying it out is payment aggregation under RBI rules. The architecture routes money tenant-to-landlord precisely to stay outside that perimeter.</w:t>
+        <w:t xml:space="preserve"> Pooling tenants' rent in one account and paying it out again is payment aggregation as far as the RBI is concerned. Money is routed tenant-to-landlord for exactly that reason: to stay outside the perimeter.</w:t>
       </w:r>
     </w:p>
     <w:p>
@@ -160,7 +160,7 @@
         <w:t xml:space="preserve">Native code cannot ship over the air.</w:t>
       </w:r>
       <w:r>
-        <w:t xml:space="preserve"> The client updates through </w:t>
+        <w:t xml:space="preserve"> Updates reach the client through </w:t>
       </w:r>
       <w:r>
         <w:rPr>
@@ -169,7 +169,7 @@
         <w:t xml:space="preserve">expo-updates</w:t>
       </w:r>
       <w:r>
-        <w:t xml:space="preserve">, which can replace JavaScript but not native modules. Features requiring a native SDK would freeze the release cadence of everything around them, so they are declined in favour of designs that ship like any other change.</w:t>
+        <w:t xml:space="preserve">, which can swap out JavaScript but not native modules. Any feature that needs a native SDK drags the release cadence of everything around it down with it, so those were turned down in favour of designs that ship like any other change.</w:t>
       </w:r>
     </w:p>
     <w:p>
@@ -183,7 +183,7 @@
     <w:p>
       <w:pPr/>
       <w:r>
-        <w:t xml:space="preserve">The server mediates every piece of information about a tenancy and no part of the payment itself. The dashed band below is the money path: it touches the tenant and the landlord and nothing else.</w:t>
+        <w:t xml:space="preserve">Every piece of information about a tenancy goes through the server. No part of the payment does. In the diagram below, the dashed band is the money path; it touches the tenant and the landlord, and nothing in between.</w:t>
       </w:r>
     </w:p>
     <w:p>
@@ -231,7 +231,7 @@
     <w:p>
       <w:pPr/>
       <w:r>
-        <w:t xml:space="preserve">The client is a single React Native codebase serving both roles. State is derived through one pure function, </w:t>
+        <w:t xml:space="preserve">One React Native codebase serves both roles. State goes through a single pure function, </w:t>
       </w:r>
       <w:r>
         <w:rPr>
@@ -240,13 +240,13 @@
         <w:t xml:space="preserve">deriveVm(state, api)</w:t>
       </w:r>
       <w:r>
-        <w:t xml:space="preserve">, which maps server data to everything the screens render; this is what makes the interface testable without a device, and is exercised directly by one of the suites in Section 7.</w:t>
-      </w:r>
-    </w:p>
-    <w:p>
-      <w:pPr/>
-      <w:r>
-        <w:t xml:space="preserve">The API is organised as routers with a role guard mounted once per router rather than per handler. Landlord and tenant accounts live in separate tables with independent auto-increments, so identity alone is not authorisation — </w:t>
+        <w:t xml:space="preserve">, which turns server data into everything the screens render. That is what makes the interface testable without a device, and one of the suites in Section 7 exercises it directly.</w:t>
+      </w:r>
+    </w:p>
+    <w:p>
+      <w:pPr/>
+      <w:r>
+        <w:t xml:space="preserve">The API is organised as routers, each with its role guard mounted once at the top rather than repeated in every handler. Landlord and tenant accounts sit in separate tables with their own auto-increments, so knowing who somebody is does not settle what they may do. </w:t>
       </w:r>
       <w:r>
         <w:rPr>
@@ -255,7 +255,7 @@
         <w:t xml:space="preserve">requireOwner</w:t>
       </w:r>
       <w:r>
-        <w:t xml:space="preserve"> rejects a tenant token on a landlord route, and tenant handlers scope every query through the </w:t>
+        <w:t xml:space="preserve"> turns away a tenant token on a landlord route, and tenant handlers scope every query through the </w:t>
       </w:r>
       <w:r>
         <w:rPr>
@@ -279,7 +279,7 @@
     <w:p>
       <w:pPr/>
       <w:r>
-        <w:t xml:space="preserve">Schema changes apply idempotently at boot: </w:t>
+        <w:t xml:space="preserve">Schema changes apply themselves at boot, and apply safely more than once: </w:t>
       </w:r>
       <w:r>
         <w:rPr>
@@ -297,7 +297,7 @@
         <w:t xml:space="preserve">CREATE TABLE IF NOT EXISTS</w:t>
       </w:r>
       <w:r>
-        <w:t xml:space="preserve"> on every start, and column-level migrations run through </w:t>
+        <w:t xml:space="preserve"> on every start, and column-level migrations go through </w:t>
       </w:r>
       <w:r>
         <w:rPr>
@@ -315,7 +315,7 @@
         <w:t xml:space="preserve">ensureIndex</w:t>
       </w:r>
       <w:r>
-        <w:t xml:space="preserve"> guards. A deploy never requires a manual migration step.</w:t>
+        <w:t xml:space="preserve"> guards. No deploy has ever needed a manual migration step.</w:t>
       </w:r>
     </w:p>
     <w:p>
@@ -329,7 +329,7 @@
     <w:p>
       <w:pPr/>
       <w:r>
-        <w:t xml:space="preserve">All screenshots below are of the running application against a seeded database of three properties, six rooms and ten tenants. No figure in them is placeholder text.</w:t>
+        <w:t xml:space="preserve">Every screenshot below comes from the running application, working against a seeded database of three properties, six rooms and ten tenants. None of the figures in them are placeholder text.</w:t>
       </w:r>
     </w:p>
     <w:p>
@@ -343,7 +343,7 @@
     <w:p>
       <w:pPr/>
       <w:r>
-        <w:t xml:space="preserve">The landing screen answers the two questions a landlord opens the app for: who has paid, and who has not.</w:t>
+        <w:t xml:space="preserve">The landing screen answers the two questions that make a landlord open the app at all: who has paid, and who has not.</w:t>
       </w:r>
     </w:p>
     <w:p>
@@ -385,13 +385,13 @@
     <w:p>
       <w:pPr/>
       <w:r>
-        <w:t xml:space="preserve">Collection is shown against expectation rather than as a bare total — ₹48,500 of ₹55,750, nine of ten paid — because a number with no denominator cannot be acted on. Overdue is given its own card with a person count. The revenue series is derived from confirmed payments only; declared-but-unconfirmed claims are deliberately excluded, since counting them would overstate income on the strength of a tenant's assertion.</w:t>
-      </w:r>
-    </w:p>
-    <w:p>
-      <w:pPr/>
-      <w:r>
-        <w:t xml:space="preserve">The bell carries a live count of things requiring a decision: declared payments awaiting confirmation, and join requests.</w:t>
+        <w:t xml:space="preserve">Collection is shown against what was expected rather than as a bare total: ₹48,500 of ₹55,750, nine of ten paid. A number with no denominator is not something anyone can act on. Overdue gets a card of its own, with a count of people attached. The revenue series is built from confirmed payments only. Claims that have been declared but not yet confirmed are left out on purpose, since including them would inflate income on nothing more than a tenant's word.</w:t>
+      </w:r>
+    </w:p>
+    <w:p>
+      <w:pPr/>
+      <w:r>
+        <w:t xml:space="preserve">The bell carries a live count of whatever is waiting on a decision, which means declared payments and join requests.</w:t>
       </w:r>
     </w:p>
     <w:p>
@@ -441,7 +441,7 @@
     <w:p>
       <w:pPr/>
       <w:r>
-        <w:t xml:space="preserve">Each row carries the tenant's property and room, their rent share, a payment-behaviour score, and a due-state chip — </w:t>
+        <w:t xml:space="preserve">Each row carries the tenant's property and room, their share of the rent, a payment-behaviour score and a due-state chip: </w:t>
       </w:r>
       <w:r>
         <w:rPr>
@@ -459,7 +459,7 @@
         <w:t xml:space="preserve">19D LATE</w:t>
       </w:r>
       <w:r>
-        <w:t xml:space="preserve">, or a leaving date for a tenant who has given notice. The filter chips are counted, so the distribution is visible before any of them is tapped.</w:t>
+        <w:t xml:space="preserve">, or a leaving date once a tenant has given notice. The filter chips carry counts, so the spread is visible before any of them is tapped.</w:t>
       </w:r>
     </w:p>
     <w:p>
@@ -471,7 +471,7 @@
         <w:t xml:space="preserve">UNASSIGNED</w:t>
       </w:r>
       <w:r>
-        <w:t xml:space="preserve"> is not an edge case bolted on: a tenant can exist without a room, and that state is reachable from the roster rather than hidden. The end-to-end suite asserts that such a row renders no broken room label.</w:t>
+        <w:t xml:space="preserve"> was not bolted on afterwards as an edge case. A tenant is allowed to exist without a room, and that state is reachable from the roster instead of being tucked away somewhere. The end-to-end suite checks that such a row renders without a broken room label.</w:t>
       </w:r>
     </w:p>
     <w:p>
@@ -521,7 +521,7 @@
     <w:p>
       <w:pPr/>
       <w:r>
-        <w:t xml:space="preserve">Properties hold rooms; rooms hold tenants, with per-room rent, capacity and an equal or custom split across occupants. A room's status follows its occupancy automatically. Each room carries its own notification preferences — email, SMS and WhatsApp independently — because a landlord's channel choice is not uniform across a portfolio.</w:t>
+        <w:t xml:space="preserve">Properties hold rooms and rooms hold tenants, each room with its own rent, its capacity, and a split across occupants that can be equal or set by hand. A room's status follows its occupancy on its own. Notification preferences are per room, with email, SMS and WhatsApp switched independently, because a landlord rarely wants the same channel across a whole portfolio.</w:t>
       </w:r>
     </w:p>
     <w:p>
@@ -571,7 +571,7 @@
     <w:p>
       <w:pPr/>
       <w:r>
-        <w:t xml:space="preserve">Every confirmed payment, searchable and scopable to one property. Payments carry the due date they settled, captured at declaration — without it, "was this on time?" is unanswerable after the fact, because the tenant's next-due date moves forward on confirmation and overwrites the only evidence. That omission was the reason the behaviour score once reported "None missed" for every tenant.</w:t>
+        <w:t xml:space="preserve">Every confirmed payment, searchable and narrowable to a single property. Each payment stores the due date it settled, captured at the moment of declaration. Without that field, "was this on time?" becomes unanswerable after the fact: confirming a payment moves the tenant's next-due date forward, and that overwrites the only evidence there was. Leaving it out is why the behaviour score once reported "None missed" for every tenant on the books.</w:t>
       </w:r>
     </w:p>
     <w:p>
@@ -621,13 +621,13 @@
     <w:p>
       <w:pPr/>
       <w:r>
-        <w:t xml:space="preserve">The sheet states the price next to the proposition, because quoting one without the other is how somebody enables a 2% fee without noticing. It also states what the gateway will demand before the landlord sets off — PAN, a bank account, one business proof, and two to five working days — along with the fact that test keys work immediately and tenants can keep paying by UPI throughout. A landlord expecting five minutes and meeting a week concludes the application is broken.</w:t>
-      </w:r>
-    </w:p>
-    <w:p>
-      <w:pPr/>
-      <w:r>
-        <w:t xml:space="preserve">Credentials are verified against the gateway </w:t>
+        <w:t xml:space="preserve">The sheet puts the price right next to the offer. Describing one without the other is how somebody switches on a 2% fee without noticing. It also spells out what the gateway is going to ask for before the landlord sets off: PAN, a bank account, one business proof, and two to five working days. It adds that test keys work straight away and that tenants can carry on paying by UPI the whole time. A landlord who expects five minutes and runs into a week concludes the application is broken.</w:t>
+      </w:r>
+    </w:p>
+    <w:p>
+      <w:pPr/>
+      <w:r>
+        <w:t xml:space="preserve">Credentials are checked against the gateway </w:t>
       </w:r>
       <w:r>
         <w:rPr>
@@ -637,7 +637,7 @@
         <w:t xml:space="preserve">before</w:t>
       </w:r>
       <w:r>
-        <w:t xml:space="preserve"> being stored, so a mistyped secret is caught while the landlord is still looking at the form. They are then sealed with AES-256-GCM and never returned to any client.</w:t>
+        <w:t xml:space="preserve"> anything is stored, so a mistyped secret gets caught while the landlord still has the form in front of them. What is stored is sealed with AES-256-GCM, and it is never returned to any client.</w:t>
       </w:r>
     </w:p>
     <w:p>
@@ -661,10 +661,10 @@
           <w:b/>
           <w:bCs/>
         </w:rPr>
-        <w:t xml:space="preserve">Join requests</w:t>
-      </w:r>
-      <w:r>
-        <w:t xml:space="preserve"> — a tenant asks to join a property by code; the landlord accepts or declines, optionally assigning a room.</w:t>
+        <w:t xml:space="preserve">Join requests.</w:t>
+      </w:r>
+      <w:r>
+        <w:t xml:space="preserve"> A tenant asks to join a property using a code, and the landlord accepts or declines, assigning a room at the same time if they want to.</w:t>
       </w:r>
     </w:p>
     <w:p>
@@ -680,10 +680,10 @@
           <w:b/>
           <w:bCs/>
         </w:rPr>
-        <w:t xml:space="preserve">Maintenance threads</w:t>
-      </w:r>
-      <w:r>
-        <w:t xml:space="preserve"> — per-request conversations shared with the tenant, with status transitions recorded as events in the thread.</w:t>
+        <w:t xml:space="preserve">Maintenance threads.</w:t>
+      </w:r>
+      <w:r>
+        <w:t xml:space="preserve"> A conversation per request, shared with the tenant, where status changes are recorded as events in the thread itself.</w:t>
       </w:r>
     </w:p>
     <w:p>
@@ -699,10 +699,10 @@
           <w:b/>
           <w:bCs/>
         </w:rPr>
-        <w:t xml:space="preserve">ID documents</w:t>
-      </w:r>
-      <w:r>
-        <w:t xml:space="preserve"> — tenant-uploaded proofs, with a blurred preview served under a short-lived token for tenants who have moved out.</w:t>
+        <w:t xml:space="preserve">ID documents.</w:t>
+      </w:r>
+      <w:r>
+        <w:t xml:space="preserve"> Proofs uploaded by the tenant. For tenants who have moved out, the preview is blurred and served under a short-lived token.</w:t>
       </w:r>
     </w:p>
     <w:p>
@@ -718,10 +718,10 @@
           <w:b/>
           <w:bCs/>
         </w:rPr>
-        <w:t xml:space="preserve">Payment confirmation queue</w:t>
-      </w:r>
-      <w:r>
-        <w:t xml:space="preserve"> — declared payments with the full context needed to decide, confirmed or rejected with a reason the tenant sees.</w:t>
+        <w:t xml:space="preserve">Payment confirmation queue.</w:t>
+      </w:r>
+      <w:r>
+        <w:t xml:space="preserve"> Declared payments with enough context around them to decide, confirmed or rejected with a reason the tenant gets to read.</w:t>
       </w:r>
     </w:p>
     <w:p>
@@ -737,10 +737,10 @@
           <w:b/>
           <w:bCs/>
         </w:rPr>
-        <w:t xml:space="preserve">Notice periods</w:t>
-      </w:r>
-      <w:r>
-        <w:t xml:space="preserve"> — a tenant's leave date, computed server-side and shown on both sides.</w:t>
+        <w:t xml:space="preserve">Notice periods.</w:t>
+      </w:r>
+      <w:r>
+        <w:t xml:space="preserve"> A tenant's leave date, worked out on the server and shown to both sides.</w:t>
       </w:r>
     </w:p>
     <w:p>
@@ -756,10 +756,10 @@
           <w:b/>
           <w:bCs/>
         </w:rPr>
-        <w:t xml:space="preserve">Daily rent reminders</w:t>
-      </w:r>
-      <w:r>
-        <w:t xml:space="preserve"> — an 8am job across email, push, SMS and WhatsApp, each phrasing the same day identically.</w:t>
+        <w:t xml:space="preserve">Daily rent reminders.</w:t>
+      </w:r>
+      <w:r>
+        <w:t xml:space="preserve"> An 8am job across email, push, SMS and WhatsApp, with every channel phrasing the same day the same way.</w:t>
       </w:r>
     </w:p>
     <w:p>
@@ -778,7 +778,7 @@
         <w:t xml:space="preserve">Google sign-in</w:t>
       </w:r>
       <w:r>
-        <w:t xml:space="preserve">, profile management with contact verification, and a demo-account reset.</w:t>
+        <w:t xml:space="preserve">, profile management with contact verification, and a reset for the demo account.</w:t>
       </w:r>
     </w:p>
     <w:p>
@@ -792,7 +792,7 @@
     <w:p>
       <w:pPr/>
       <w:r>
-        <w:t xml:space="preserve">The tenant portal is not a reduced copy of the landlord application. It answers a different question — what do I owe, and has it been acknowledged — and it is reached by a separate account type with its own table and its own token role.</w:t>
+        <w:t xml:space="preserve">The tenant portal is not a cut-down version of the landlord app. It answers a different question: what do I owe, and has anyone acknowledged it? Getting in means a separate account type, with its own table and its own token role.</w:t>
       </w:r>
     </w:p>
     <w:p>
@@ -842,13 +842,13 @@
     <w:p>
       <w:pPr/>
       <w:r>
-        <w:t xml:space="preserve">The rent card carries the amount, the property and room, the exact due date and a countdown. Deposit held and tenure sit beneath it, because both are facts a tenant routinely cannot recall and has no other record of.</w:t>
-      </w:r>
-    </w:p>
-    <w:p>
-      <w:pPr/>
-      <w:r>
-        <w:t xml:space="preserve">The bell derives its state from the same payload the screen renders, rather than from a separate unread count that could drift. It surfaces rent falling due, a landlord's reply on a maintenance thread, a payment confirmed or rejected, and the outcome of a join request. A server-stamped </w:t>
+        <w:t xml:space="preserve">The rent card carries the amount, the property and room, the exact due date and a countdown to it. Deposit held and tenure sit underneath. Both are things tenants routinely cannot remember and have no other record of.</w:t>
+      </w:r>
+    </w:p>
+    <w:p>
+      <w:pPr/>
+      <w:r>
+        <w:t xml:space="preserve">The bell works off the same payload the screen renders, not a separate unread count that could drift away from it. What shows up there: rent falling due, a landlord's reply on a maintenance thread, a payment confirmed or rejected, and the outcome of a join request. An </w:t>
       </w:r>
       <w:r>
         <w:rPr>
@@ -857,7 +857,7 @@
         <w:t xml:space="preserve">alerts_seen_at</w:t>
       </w:r>
       <w:r>
-        <w:t xml:space="preserve"> distinguishes an alert that is </w:t>
+        <w:t xml:space="preserve"> timestamp tells an alert that is </w:t>
       </w:r>
       <w:r>
         <w:rPr>
@@ -867,7 +867,7 @@
         <w:t xml:space="preserve">news</w:t>
       </w:r>
       <w:r>
-        <w:t xml:space="preserve"> from one that is merely still true — and the server stamps it, so a device with a wrong clock cannot silence its own alerts.</w:t>
+        <w:t xml:space="preserve"> apart from one that is merely still true. The server stamps it, so a phone with the wrong clock cannot silence its own alerts.</w:t>
       </w:r>
     </w:p>
     <w:p>
@@ -917,13 +917,13 @@
     <w:p>
       <w:pPr/>
       <w:r>
-        <w:t xml:space="preserve">The screen shows what is owed, a reference, and ₹0 as the platform fee, which is literally true on both routes.</w:t>
-      </w:r>
-    </w:p>
-    <w:p>
-      <w:pPr/>
-      <w:r>
-        <w:t xml:space="preserve">When the landlord has connected a gateway, </w:t>
+        <w:t xml:space="preserve">The screen shows what is owed, a reference and ₹0 as the platform fee. On both routes that figure is literally true.</w:t>
+      </w:r>
+    </w:p>
+    <w:p>
+      <w:pPr/>
+      <w:r>
+        <w:t xml:space="preserve">Where the landlord has connected a gateway, </w:t>
       </w:r>
       <w:r>
         <w:rPr>
@@ -933,7 +933,7 @@
         <w:t xml:space="preserve">Pay by card, UPI or netbanking</w:t>
       </w:r>
       <w:r>
-        <w:t xml:space="preserve"> appears first, because it is the only route that confirms itself. Beneath an </w:t>
+        <w:t xml:space="preserve"> comes first, since it is the only route that confirms itself. Below an </w:t>
       </w:r>
       <w:r>
         <w:rPr>
@@ -942,19 +942,19 @@
         <w:t xml:space="preserve">OR</w:t>
       </w:r>
       <w:r>
-        <w:t xml:space="preserve"> divider sits the UPI route: the landlord's VPA, the amount and the reference encoded as a QR that works when scanned from another phone, plus a hand-off to the tenant's own UPI app on this one.</w:t>
-      </w:r>
-    </w:p>
-    <w:p>
-      <w:pPr/>
-      <w:r>
-        <w:t xml:space="preserve">The two buttons are styled differently on purpose. Two filled primary buttons are two primary actions, which is none; the UPI button is outlined when a louder option sits above it and filled when it is the only option.</w:t>
-      </w:r>
-    </w:p>
-    <w:p>
-      <w:pPr/>
-      <w:r>
-        <w:t xml:space="preserve">After returning from a gateway page the button reads </w:t>
+        <w:t xml:space="preserve"> divider sits the UPI route: the landlord's VPA, the amount and the reference, encoded as a QR that works when scanned from another phone, with a hand-off to the tenant's own UPI app for people paying on this one.</w:t>
+      </w:r>
+    </w:p>
+    <w:p>
+      <w:pPr/>
+      <w:r>
+        <w:t xml:space="preserve">The two buttons look different on purpose. Two filled primary buttons amount to two primary actions, which is the same as having none. So the UPI button is outlined when something louder sits above it, and filled when it is the only thing on offer.</w:t>
+      </w:r>
+    </w:p>
+    <w:p>
+      <w:pPr/>
+      <w:r>
+        <w:t xml:space="preserve">Coming back from a gateway page, the button reads </w:t>
       </w:r>
       <w:r>
         <w:rPr>
@@ -964,7 +964,7 @@
         <w:t xml:space="preserve">Check my payment</w:t>
       </w:r>
       <w:r>
-        <w:t xml:space="preserve">, not "Yes, I paid" — because on that route the answer is not the tenant's to give.</w:t>
+        <w:t xml:space="preserve"> rather than "Yes, I paid". On that route the answer is not the tenant's to give.</w:t>
       </w:r>
     </w:p>
     <w:p>
@@ -1014,13 +1014,13 @@
     <w:p>
       <w:pPr/>
       <w:r>
-        <w:t xml:space="preserve">The behaviour score is computed by the same code the landlord's copy uses. Sharing it is the point: a tenant shown a different number from the one their landlord sees has no way to argue with either. Its factors are itemised rather than reduced to a dial, and when there is too little history the screen says so instead of parking a needle at zero, which would read as a verdict the tenant had earned.</w:t>
-      </w:r>
-    </w:p>
-    <w:p>
-      <w:pPr/>
-      <w:r>
-        <w:t xml:space="preserve">The payment timeline is derived from actual rows. A claim still awaiting the landlord shows amber </w:t>
+        <w:t xml:space="preserve">The behaviour score runs through the same code that produces the landlord's copy of it. Sharing the code is the whole point. A tenant looking at a different number from the one their landlord sees cannot argue with either of them. The factors are listed out instead of being boiled down to a dial, and where there is too little history to say anything, the screen says so. The alternative is a needle parked at zero, which reads like a verdict the tenant has earned.</w:t>
+      </w:r>
+    </w:p>
+    <w:p>
+      <w:pPr/>
+      <w:r>
+        <w:t xml:space="preserve">The payment timeline is built from real rows. A claim still waiting on the landlord shows an amber </w:t>
       </w:r>
       <w:r>
         <w:rPr>
@@ -1029,7 +1029,7 @@
         <w:t xml:space="preserve">AWAITING</w:t>
       </w:r>
       <w:r>
-        <w:t xml:space="preserve"> rather than the green of money that has arrived — showing them alike is how a tenant comes to believe their month is clear when it is not.</w:t>
+        <w:t xml:space="preserve">, not the green reserved for money that has actually arrived. Show the two alike and a tenant will believe their month is clear when it is not.</w:t>
       </w:r>
     </w:p>
     <w:p>
@@ -1079,7 +1079,7 @@
     <w:p>
       <w:pPr/>
       <w:r>
-        <w:t xml:space="preserve">A tenant raises a request with a category, a priority and an optional photo, then follows it through a thread shared with the landlord. Status changes appear in the thread as events, in sequence with what was said around them.</w:t>
+        <w:t xml:space="preserve">A tenant raises a request with a category, a priority and a photo if they have one, then follows it in a thread shared with the landlord. Status changes land in that thread as events, in order with whatever was said around them.</w:t>
       </w:r>
     </w:p>
     <w:p>
@@ -1103,10 +1103,10 @@
           <w:b/>
           <w:bCs/>
         </w:rPr>
-        <w:t xml:space="preserve">Guest accounts</w:t>
-      </w:r>
-      <w:r>
-        <w:t xml:space="preserve"> — a tenant with no email, identified by a code, with a stay window; expiry is enforced server-side and the lock-out message offers the one action that resolves it.</w:t>
+        <w:t xml:space="preserve">Guest accounts.</w:t>
+      </w:r>
+      <w:r>
+        <w:t xml:space="preserve"> A tenant with no email, identified by a code, with a stay window attached. Expiry is enforced on the server, and the lock-out message offers the one action that resolves it.</w:t>
       </w:r>
     </w:p>
     <w:p>
@@ -1122,10 +1122,10 @@
           <w:b/>
           <w:bCs/>
         </w:rPr>
-        <w:t xml:space="preserve">Claiming an account</w:t>
-      </w:r>
-      <w:r>
-        <w:t xml:space="preserve"> — a guest converts to a full account with a name, email and password.</w:t>
+        <w:t xml:space="preserve">Claiming an account.</w:t>
+      </w:r>
+      <w:r>
+        <w:t xml:space="preserve"> A guest turns into a full account with a name, email and password.</w:t>
       </w:r>
     </w:p>
     <w:p>
@@ -1141,10 +1141,10 @@
           <w:b/>
           <w:bCs/>
         </w:rPr>
-        <w:t xml:space="preserve">Joining a property</w:t>
-      </w:r>
-      <w:r>
-        <w:t xml:space="preserve"> — by scanning or typing an invite code, with the property shown before the request is sent.</w:t>
+        <w:t xml:space="preserve">Joining a property.</w:t>
+      </w:r>
+      <w:r>
+        <w:t xml:space="preserve"> By scanning or typing an invite code, with the property shown before the request goes anywhere.</w:t>
       </w:r>
     </w:p>
     <w:p>
@@ -1160,10 +1160,10 @@
           <w:b/>
           <w:bCs/>
         </w:rPr>
-        <w:t xml:space="preserve">Receipts</w:t>
-      </w:r>
-      <w:r>
-        <w:t xml:space="preserve"> — the full payment history with status, reference, and the rejection reason where one was given.</w:t>
+        <w:t xml:space="preserve">Receipts.</w:t>
+      </w:r>
+      <w:r>
+        <w:t xml:space="preserve"> The full payment history, with status, reference and the rejection reason wherever one was given.</w:t>
       </w:r>
     </w:p>
     <w:p>
@@ -1179,10 +1179,10 @@
           <w:b/>
           <w:bCs/>
         </w:rPr>
-        <w:t xml:space="preserve">Giving notice</w:t>
-      </w:r>
-      <w:r>
-        <w:t xml:space="preserve"> — with the real dates computed and shown before anything is written, and withdrawable afterwards.</w:t>
+        <w:t xml:space="preserve">Giving notice.</w:t>
+      </w:r>
+      <w:r>
+        <w:t xml:space="preserve"> The real dates are worked out and shown before anything is written, and the notice can be withdrawn afterwards.</w:t>
       </w:r>
     </w:p>
     <w:p>
@@ -1198,10 +1198,10 @@
           <w:b/>
           <w:bCs/>
         </w:rPr>
-        <w:t xml:space="preserve">ID documents</w:t>
-      </w:r>
-      <w:r>
-        <w:t xml:space="preserve"> — upload and removal, with a summary the landlord sees when deciding on a join request.</w:t>
+        <w:t xml:space="preserve">ID documents.</w:t>
+      </w:r>
+      <w:r>
+        <w:t xml:space="preserve"> Upload and removal, with a summary the landlord sees while deciding on a join request.</w:t>
       </w:r>
     </w:p>
     <w:p>
@@ -1217,10 +1217,10 @@
           <w:b/>
           <w:bCs/>
         </w:rPr>
-        <w:t xml:space="preserve">Directions</w:t>
-      </w:r>
-      <w:r>
-        <w:t xml:space="preserve"> — to the tenant's own property, when the landlord has pinned it.</w:t>
+        <w:t xml:space="preserve">Directions.</w:t>
+      </w:r>
+      <w:r>
+        <w:t xml:space="preserve"> To the tenant's own property, where the landlord has pinned it.</w:t>
       </w:r>
     </w:p>
     <w:p>
@@ -1234,7 +1234,7 @@
     <w:p>
       <w:pPr/>
       <w:r>
-        <w:t xml:space="preserve">Three structures exist for moving money between two parties on a platform. TenantPro occupies the third, and the choice is deliberate rather than incidental.</w:t>
+        <w:t xml:space="preserve">There are three ways to move money between two parties on a platform. TenantPro uses the third, and that was a choice rather than an accident.</w:t>
       </w:r>
     </w:p>
     <w:tbl>
@@ -1452,7 +1452,7 @@
     <w:p>
       <w:pPr/>
       <w:r>
-        <w:t xml:space="preserve">Under RBI rules an aggregator may not hold customer funds in its own account; the money sits in a segregated escrow that cannot earn interest for the platform and must be settled out on a deadline. Obtaining that authorisation requires a net-worth floor in the tens of crores. TenantPro avoids the question entirely by never receiving the money.</w:t>
+        <w:t xml:space="preserve">RBI rules do not let an aggregator keep customer funds in its own account. The money has to sit in a segregated escrow, where it earns the platform no interest and has to be settled out by a deadline. Getting that authorisation in the first place means clearing a net-worth floor in the tens of crores. TenantPro sidesteps the whole question by never receiving the money.</w:t>
       </w:r>
     </w:p>
     <w:p>
@@ -1473,7 +1473,7 @@
         <w:t xml:space="preserve">UPI.</w:t>
       </w:r>
       <w:r>
-        <w:t xml:space="preserve"> The tenant's screen carries the landlord's own VPA, the exact amount and a generated reference, encoded as a QR and as a </w:t>
+        <w:t xml:space="preserve"> The tenant's screen carries the landlord's own VPA, the exact amount and a generated reference, encoded both as a QR and as a </w:t>
       </w:r>
       <w:r>
         <w:rPr>
@@ -1482,7 +1482,7 @@
         <w:t xml:space="preserve">upi://</w:t>
       </w:r>
       <w:r>
-        <w:t xml:space="preserve"> intent. The tenant pays from their own UPI app. Cost to everyone: zero.</w:t>
+        <w:t xml:space="preserve"> intent. The tenant pays from whichever UPI app they already use. It costs everybody nothing.</w:t>
       </w:r>
     </w:p>
     <w:p>
@@ -1495,7 +1495,7 @@
         <w:t xml:space="preserve">Gateway.</w:t>
       </w:r>
       <w:r>
-        <w:t xml:space="preserve"> A landlord may connect their own Razorpay merchant account. The server then creates a Payment Link against </w:t>
+        <w:t xml:space="preserve"> A landlord can connect their own Razorpay merchant account. The server then creates a Payment Link using </w:t>
       </w:r>
       <w:r>
         <w:rPr>
@@ -1505,13 +1505,13 @@
         <w:t xml:space="preserve">their</w:t>
       </w:r>
       <w:r>
-        <w:t xml:space="preserve"> credentials; the tenant pays on the gateway's hosted page and the money settles to that landlord. Razorpay's fee is charged by their gateway to them. The platform bills nothing because it is party to nothing.</w:t>
-      </w:r>
-    </w:p>
-    <w:p>
-      <w:pPr/>
-      <w:r>
-        <w:t xml:space="preserve">Payment Links were chosen over Razorpay's React Native SDK specifically because the SDK is a native module. A link is plain REST over HTTPS, so the payment feature ships over the air like every other change.</w:t>
+        <w:t xml:space="preserve"> credentials, the tenant pays on Razorpay's hosted page, and the money settles to that landlord. Razorpay charges its fee to them, through their own account. The platform bills nothing, because it is party to nothing.</w:t>
+      </w:r>
+    </w:p>
+    <w:p>
+      <w:pPr/>
+      <w:r>
+        <w:t xml:space="preserve">Payment Links were picked over Razorpay's React Native SDK for one reason: the SDK is a native module. A link is plain REST over HTTPS, which means the payment feature ships over the air like everything else.</w:t>
       </w:r>
     </w:p>
     <w:p>
@@ -1525,7 +1525,7 @@
     <w:p>
       <w:pPr/>
       <w:r>
-        <w:t xml:space="preserve">A payment begins life as a </w:t>
+        <w:t xml:space="preserve">A payment starts out as a </w:t>
       </w:r>
       <w:r>
         <w:rPr>
@@ -1534,7 +1534,7 @@
         <w:t xml:space="preserve">Declared</w:t>
       </w:r>
       <w:r>
-        <w:t xml:space="preserve"> row — a claim, which clears nothing. It becomes real when a second party vouches for it:</w:t>
+        <w:t xml:space="preserve"> row. That is a claim, and it clears nothing on its own. It becomes real when a second party vouches for it:</w:t>
       </w:r>
     </w:p>
     <w:p>
@@ -1578,13 +1578,13 @@
         <w:t xml:space="preserve">gateway</w:t>
       </w:r>
       <w:r>
-        <w:t xml:space="preserve"> is asked directly, server-to-server, using the landlord's credentials, and answers that the link was paid.</w:t>
-      </w:r>
-    </w:p>
-    <w:p>
-      <w:pPr/>
-      <w:r>
-        <w:t xml:space="preserve">Both paths call one function, </w:t>
+        <w:t xml:space="preserve"> is asked outright, server-to-server with the landlord's credentials, and says the link was paid.</w:t>
+      </w:r>
+    </w:p>
+    <w:p>
+      <w:pPr/>
+      <w:r>
+        <w:t xml:space="preserve">Both paths end up in the same function, </w:t>
       </w:r>
       <w:r>
         <w:rPr>
@@ -1593,13 +1593,13 @@
         <w:t xml:space="preserve">settlePayment</w:t>
       </w:r>
       <w:r>
-        <w:t xml:space="preserve">, which flips the status and advances the tenant's next due date inside a single transaction. Two implementations would eventually disagree about when a month clears, so there is one.</w:t>
-      </w:r>
-    </w:p>
-    <w:p>
-      <w:pPr/>
-      <w:r>
-        <w:t xml:space="preserve">The gateway is polled rather than relied on to call back. A webhook requires each landlord to configure a URL and a secret in a dashboard, and a feature gated on that step is one most landlords would never finish switching on. The signed-webhook path exists and remains supported, but it is the secondary route.</w:t>
+        <w:t xml:space="preserve">, which flips the status and moves the tenant's next due date forward inside one transaction. Write it twice and the two copies will eventually disagree about when a month has cleared, so it is written once.</w:t>
+      </w:r>
+    </w:p>
+    <w:p>
+      <w:pPr/>
+      <w:r>
+        <w:t xml:space="preserve">The gateway gets polled rather than trusted to call back. A webhook would mean every landlord configuring a URL and a secret in a dashboard, and most of them would never get to the end of that. The signed-webhook path does exist and is still supported; it is just the secondary route.</w:t>
       </w:r>
     </w:p>
     <w:p>
@@ -1613,7 +1613,7 @@
     <w:p>
       <w:pPr/>
       <w:r>
-        <w:t xml:space="preserve">The session design went through three states, and the progression is instructive because the first two each fixed a real problem while introducing the next one.</w:t>
+        <w:t xml:space="preserve">The session design went through three versions. The sequence is worth following, because each of the first two fixed something real and created the next problem on the way.</w:t>
       </w:r>
     </w:p>
     <w:tbl>
@@ -1878,7 +1878,7 @@
     <w:p>
       <w:pPr/>
       <w:r>
-        <w:t xml:space="preserve">Raising the lifetime from 7 days to 30 did not stop people being logged out; it made it monthly. A fixed lifetime measures from the last </w:t>
+        <w:t xml:space="preserve">Raising the lifetime from 7 days to 30 did not stop people being logged out. It made it happen monthly. A fixed lifetime counts from the last </w:t>
       </w:r>
       <w:r>
         <w:rPr>
@@ -1888,13 +1888,13 @@
         <w:t xml:space="preserve">sign-in</w:t>
       </w:r>
       <w:r>
-        <w:t xml:space="preserve">, which says nothing about whether somebody is still using the application. Someone who opened the app every morning was ejected on day 30 exactly like someone who had not opened it since February.</w:t>
-      </w:r>
-    </w:p>
-    <w:p>
-      <w:pPr/>
-      <w:r>
-        <w:t xml:space="preserve">The server therefore re-issues the access token on any authenticated request once it is past half its life, returning it on an </w:t>
+        <w:t xml:space="preserve">, which tells you nothing about whether somebody is still using the app. Open it every morning and you were thrown out on day 30, the same as somebody who had not opened it since February.</w:t>
+      </w:r>
+    </w:p>
+    <w:p>
+      <w:pPr/>
+      <w:r>
+        <w:t xml:space="preserve">So the server re-issues the access token on any authenticated request once it is past half its life, handing it back on an </w:t>
       </w:r>
       <w:r>
         <w:rPr>
@@ -1903,7 +1903,7 @@
         <w:t xml:space="preserve">X-Session-Token</w:t>
       </w:r>
       <w:r>
-        <w:t xml:space="preserve"> header the client adopts. The new token's lifetime is read from the old one's </w:t>
+        <w:t xml:space="preserve"> header that the client picks up. The new token's lifetime comes from the old one's </w:t>
       </w:r>
       <w:r>
         <w:rPr>
@@ -1912,7 +1912,7 @@
         <w:t xml:space="preserve">exp - iat</w:t>
       </w:r>
       <w:r>
-        <w:t xml:space="preserve"> rather than a constant, so a guest session keeps its own length and legacy tokens keep theirs.</w:t>
+        <w:t xml:space="preserve"> rather than from a constant. A guest session therefore keeps its own length, and older tokens keep theirs.</w:t>
       </w:r>
     </w:p>
     <w:p>
@@ -1926,13 +1926,13 @@
     <w:p>
       <w:pPr/>
       <w:r>
-        <w:t xml:space="preserve">An access token is a signature and nothing else: the server consults no list, which is what makes it fast and also meant nothing could withdraw it. A stolen phone, a departed tenant, a password change — none ended a session.</w:t>
-      </w:r>
-    </w:p>
-    <w:p>
-      <w:pPr/>
-      <w:r>
-        <w:t xml:space="preserve">A session is now also a row holding a refresh token, stored as a SHA-256 hash rather than the token itself. The design has three properties worth naming:</w:t>
+        <w:t xml:space="preserve">An access token is a signature and nothing more. The server consults no list when it verifies one, which is what makes it fast, and also meant there was no way to withdraw it. A stolen phone, a tenant who had moved out, a password change: none of them ended a session.</w:t>
+      </w:r>
+    </w:p>
+    <w:p>
+      <w:pPr/>
+      <w:r>
+        <w:t xml:space="preserve">A session is now a row as well, holding a refresh token that is stored as a SHA-256 hash rather than as the token itself. Three properties of that design are worth naming:</w:t>
       </w:r>
     </w:p>
     <w:p>
@@ -1951,7 +1951,7 @@
         <w:t xml:space="preserve">Rotation.</w:t>
       </w:r>
       <w:r>
-        <w:t xml:space="preserve"> Spending a refresh token returns a replacement. A sixty-day secret crossing the network on every reconnect is a long-lived credential; a single-use one is not.</w:t>
+        <w:t xml:space="preserve"> Spending a refresh token gets you a replacement. A sixty-day secret that crosses the network on every reconnect is a long-lived credential. One that works once is not.</w:t>
       </w:r>
     </w:p>
     <w:p>
@@ -1970,7 +1970,7 @@
         <w:t xml:space="preserve">Reuse detection.</w:t>
       </w:r>
       <w:r>
-        <w:t xml:space="preserve"> Because rotation means the honest client always holds the newest token, replaying a spent one implies a copy exists elsewhere. That revokes every session on the account. A false positive costs one sign-in; a false negative costs the account.</w:t>
+        <w:t xml:space="preserve"> Rotation means the honest client is always holding the newest token, so a replay of a spent one says a copy is sitting somewhere else. Every session on the account is revoked. Getting that wrong in one direction costs somebody a sign-in; getting it wrong in the other costs them the account.</w:t>
       </w:r>
     </w:p>
     <w:p>
@@ -1989,13 +1989,13 @@
         <w:t xml:space="preserve">Revocation on password reset.</w:t>
       </w:r>
       <w:r>
-        <w:t xml:space="preserve"> Resetting a password now ends every other session, which is the thing users already believe it does.</w:t>
-      </w:r>
-    </w:p>
-    <w:p>
-      <w:pPr/>
-      <w:r>
-        <w:t xml:space="preserve">Revocation is immediate on the refresh path and lags by at most the access token's two-hour life on the access path. Making it instant would require a database read on every authenticated request — a cost almost no system pays. Two hours against the previous thirty days is the improvement.</w:t>
+        <w:t xml:space="preserve"> Resetting a password now ends every other session. Users had always assumed it did.</w:t>
+      </w:r>
+    </w:p>
+    <w:p>
+      <w:pPr/>
+      <w:r>
+        <w:t xml:space="preserve">On the refresh path, revocation is immediate. On the access path it lags by at most the access token's two-hour life. Closing that last gap would mean a database read on every authenticated request, which is a cost almost nobody pays. The gain here is two hours where it used to be thirty days.</w:t>
       </w:r>
     </w:p>
     <w:p>
@@ -2009,7 +2009,7 @@
     <w:p>
       <w:pPr/>
       <w:r>
-        <w:t xml:space="preserve">The client half is where this design fails badly if it fails at all. A 401 triggers one refresh and one replay, and only a 401 </w:t>
+        <w:t xml:space="preserve">If this design is going to fail badly, it will fail on the client. A 401 triggers one refresh and one replay. Only a 401 </w:t>
       </w:r>
       <w:r>
         <w:rPr>
@@ -2019,13 +2019,13 @@
         <w:t xml:space="preserve">from the refresh endpoint itself</w:t>
       </w:r>
       <w:r>
-        <w:t xml:space="preserve"> ends the session; a 500, a timeout or a dead connection does not. The server deliberately answers 500 rather than 401 on its own faults so the client can tell them apart.</w:t>
-      </w:r>
-    </w:p>
-    <w:p>
-      <w:pPr/>
-      <w:r>
-        <w:t xml:space="preserve">The sharpest failure mode was concurrency. An application firing eight parallel requests on a cold start, all failing on the same expired token, would otherwise issue eight refreshes — seven of them replaying a token the first had already spent, which the server reads as theft and answers by ending every session. The feature intended to prevent lockouts would have caused them at scale. One shared in-flight promise prevents it, and the behaviour is asserted directly.</w:t>
+        <w:t xml:space="preserve"> ends the session; a 500, a timeout or a dead connection does not. The server answers 500 rather than 401 on its own faults deliberately, so that the client can tell the two apart.</w:t>
+      </w:r>
+    </w:p>
+    <w:p>
+      <w:pPr/>
+      <w:r>
+        <w:t xml:space="preserve">The nastiest failure mode was concurrency. On a cold start the app fires eight requests at once, and if they all fail on the same expired token, the naive version issues eight refreshes. Seven of those replay a token the first one has already spent, the server reads that as theft, and every session ends. A feature built to prevent lockouts would have been causing them at scale. One shared in-flight promise is what stops it, and there is an assertion on that behaviour.</w:t>
       </w:r>
     </w:p>
     <w:p>
@@ -2039,7 +2039,7 @@
     <w:p>
       <w:pPr/>
       <w:r>
-        <w:t xml:space="preserve">The build is verified by 386 assertions across six suites. None uses a test framework; each is a plain Node script that exits non-zero on failure.</w:t>
+        <w:t xml:space="preserve">386 assertions across six suites stand behind the build. None of them uses a test framework. Each suite is a plain Node script that exits non-zero when something fails.</w:t>
       </w:r>
     </w:p>
     <w:tbl>
@@ -2536,7 +2536,7 @@
         <w:t xml:space="preserve">scripts/seed.js</w:t>
       </w:r>
       <w:r>
-        <w:t xml:space="preserve">) produces a portfolio that includes, on purpose, the rows that break screens and never arise by accident: a tenant with no room, a guest with no email, a guest whose stay has </w:t>
+        <w:t xml:space="preserve">) builds a portfolio that deliberately contains the rows which break screens and never turn up when you are looking for them: a tenant with no room, a guest with no email, a guest whose stay has </w:t>
       </w:r>
       <w:r>
         <w:rPr>
@@ -2546,7 +2546,7 @@
         <w:t xml:space="preserve">already</w:t>
       </w:r>
       <w:r>
-        <w:t xml:space="preserve"> ended, rent overdue and due-today and upcoming and never set, a payment declared and undecided, one rejected with a reason, maintenance threads where the landlord spoke last and where the tenant did, a tenant who has given notice, and a property with no rooms. A seeded PRNG makes any failing run reproducible.</w:t>
+        <w:t xml:space="preserve"> ended, rent overdue and due today and upcoming and never set at all, a payment declared and undecided, another rejected with a reason, maintenance threads where the landlord spoke last and others where the tenant did, a tenant who has given notice, and a property with no rooms in it. The PRNG is seeded, so any failing run can be reproduced.</w:t>
       </w:r>
     </w:p>
     <w:p>
@@ -2560,7 +2560,7 @@
     <w:p>
       <w:pPr/>
       <w:r>
-        <w:t xml:space="preserve">The UI suite runs the same JavaScript the phone runs — the same view-model, screens, API client and interceptors — laid out by </w:t>
+        <w:t xml:space="preserve">The UI suite runs the same JavaScript the phone runs: the same view-model, the same screens, the same API client and interceptors, laid out by </w:t>
       </w:r>
       <w:r>
         <w:rPr>
@@ -2569,7 +2569,7 @@
         <w:t xml:space="preserve">react-native-web</w:t>
       </w:r>
       <w:r>
-        <w:t xml:space="preserve">, which is what an Expo web export produces. It cannot cover anything behind a native module: camera, image picker, push delivery, the UPI intent hand-off. It prints </w:t>
+        <w:t xml:space="preserve">, which is what an Expo web export produces. What it cannot reach is anything sitting behind a native module, so camera, image picker, push delivery and the UPI intent hand-off are all out of scope. For those it prints </w:t>
       </w:r>
       <w:r>
         <w:rPr>
@@ -2578,7 +2578,7 @@
         <w:t xml:space="preserve">SKIP</w:t>
       </w:r>
       <w:r>
-        <w:t xml:space="preserve"> rather than a pass for anything it could not reach, so a green run never implies coverage it does not have.</w:t>
+        <w:t xml:space="preserve"> instead of a pass, so a green run never claims coverage it does not have.</w:t>
       </w:r>
     </w:p>
     <w:p>
@@ -2592,7 +2592,7 @@
     <w:p>
       <w:pPr/>
       <w:r>
-        <w:t xml:space="preserve">Driving every endpoint against a real database, and the application against a real browser, surfaced five defects that unit tests had not.</w:t>
+        <w:t xml:space="preserve">Driving every endpoint against a real database, and the application against a real browser, turned up five defects the unit tests had missed.</w:t>
       </w:r>
     </w:p>
     <w:tbl>
@@ -2854,7 +2854,7 @@
     <w:p>
       <w:pPr/>
       <w:r>
-        <w:t xml:space="preserve">Two further defects were found </w:t>
+        <w:t xml:space="preserve">Two more defects turned up </w:t>
       </w:r>
       <w:r>
         <w:rPr>
@@ -2864,7 +2864,7 @@
         <w:t xml:space="preserve">in the test harnesses themselves</w:t>
       </w:r>
       <w:r>
-        <w:t xml:space="preserve">, which is worth recording. The first browser run never cleared the permissions primer, and because its assertions were phrased as the </w:t>
+        <w:t xml:space="preserve">, which is worth putting on the record. The first browser run never got past the permissions primer, and because its assertions were phrased as the </w:t>
       </w:r>
       <w:r>
         <w:rPr>
@@ -2874,7 +2874,7 @@
         <w:t xml:space="preserve">absence</w:t>
       </w:r>
       <w:r>
-        <w:t xml:space="preserve"> of a string the primer also lacked, half the suite passed while testing nothing. Separately, the failure reporter crashed on a failure whose context was </w:t>
+        <w:t xml:space="preserve"> of a string the primer also happened to lack, half the suite passed while testing nothing at all. Separately, the failure reporter crashed on a failure whose context was </w:t>
       </w:r>
       <w:r>
         <w:rPr>
@@ -2883,7 +2883,7 @@
         <w:t xml:space="preserve">undefined</w:t>
       </w:r>
       <w:r>
-        <w:t xml:space="preserve">, taking down the run it was trying to report. Both argue for positive assertions and for a failure reporter being the dullest code in the file.</w:t>
+        <w:t xml:space="preserve"> and took down the run it was supposed to be reporting. The lessons are to assert on what should be there rather than on what should not, and to keep the failure reporter the dullest code in the file.</w:t>
       </w:r>
     </w:p>
     <w:p>
@@ -2897,7 +2897,7 @@
     <w:p>
       <w:pPr/>
       <w:r>
-        <w:t xml:space="preserve">Stated plainly, because each is a consequence of a design decision rather than an oversight.</w:t>
+        <w:t xml:space="preserve">Set out plainly, since each of these follows from a design decision rather than from an oversight.</w:t>
       </w:r>
     </w:p>
     <w:p>
@@ -2910,7 +2910,7 @@
         <w:t xml:space="preserve">The application cannot observe money.</w:t>
       </w:r>
       <w:r>
-        <w:t xml:space="preserve"> It never sees a bank balance, so a UPI payment is a claim until the landlord confirms it. The gateway route removes this for landlords who connect one; for everyone else the confirmation step is structural.</w:t>
+        <w:t xml:space="preserve"> It never sees a bank balance, so a UPI payment stays a claim until the landlord confirms it. For landlords who connect a gateway, that goes away. For everyone else the confirmation step is structural.</w:t>
       </w:r>
     </w:p>
     <w:p>
@@ -2923,7 +2923,7 @@
         <w:t xml:space="preserve">Revocation lags by up to two hours on the access path.</w:t>
       </w:r>
       <w:r>
-        <w:t xml:space="preserve"> Closing that gap entirely means a database lookup on every authenticated request.</w:t>
+        <w:t xml:space="preserve"> Closing the gap completely would mean a database lookup on every authenticated request.</w:t>
       </w:r>
     </w:p>
     <w:p>
@@ -2936,7 +2936,7 @@
         <w:t xml:space="preserve">Reuse detection can produce a false positive.</w:t>
       </w:r>
       <w:r>
-        <w:t xml:space="preserve"> A client that stores a new access token but fails to store its paired refresh token will present a spent token and have every session revoked. The write is transactional on the client side, but a device that loses storage mid-write would hit this.</w:t>
+        <w:t xml:space="preserve"> If a client stores a new access token but fails to store the refresh token that came with it, the next request presents a spent token and every session gets revoked. The client-side write is transactional, but a device that loses its storage halfway through would still land here.</w:t>
       </w:r>
     </w:p>
     <w:p>
@@ -2949,7 +2949,7 @@
         <w:t xml:space="preserve">SMS is unconfigured.</w:t>
       </w:r>
       <w:r>
-        <w:t xml:space="preserve"> Phone verification requires DLT registration with an Indian telecom operator, which has not been completed. Email and push are live.</w:t>
+        <w:t xml:space="preserve"> Phone verification needs a DLT registration with an Indian telecom operator, and that has not been done. Email and push are both live.</w:t>
       </w:r>
     </w:p>
     <w:p>
@@ -2971,7 +2971,7 @@
         <w:t xml:space="preserve">ios.bundleIdentifier</w:t>
       </w:r>
       <w:r>
-        <w:t xml:space="preserve"> is unset; the project has only ever produced Android artifacts.</w:t>
+        <w:t xml:space="preserve"> is still unset, and the project has only ever produced Android artifacts.</w:t>
       </w:r>
     </w:p>
     <w:p>
@@ -2984,7 +2984,7 @@
         <w:t xml:space="preserve">Gateway onboarding is heavy.</w:t>
       </w:r>
       <w:r>
-        <w:t xml:space="preserve"> A landlord connecting Razorpay faces their KYC and a separate website verification — realistically two to five working days. The in-app sheet now states this before they begin, but it remains the single largest piece of friction in the product.</w:t>
+        <w:t xml:space="preserve"> A landlord connecting Razorpay has to get through their KYC and a separate website verification, which realistically takes two to five working days. The in-app sheet now says so before they start, but it is still the biggest piece of friction in the product.</w:t>
       </w:r>
     </w:p>
     <w:p>
@@ -2997,7 +2997,7 @@
         <w:t xml:space="preserve">No automated regression gate.</w:t>
       </w:r>
       <w:r>
-        <w:t xml:space="preserve"> The suites exist and pass, but nothing runs them on push; verification is currently manual and deliberate.</w:t>
+        <w:t xml:space="preserve"> The suites exist and they pass, but nothing runs them on push. Verification is a manual step somebody has to decide to take.</w:t>
       </w:r>
     </w:p>
     <w:p>
@@ -3026,7 +3026,7 @@
         <w:t xml:space="preserve">Reply notifications on maintenance threads.</w:t>
       </w:r>
       <w:r>
-        <w:t xml:space="preserve"> A tenant replying to a repair request currently notifies nobody: </w:t>
+        <w:t xml:space="preserve"> When a tenant replies to a repair request, nobody is told: </w:t>
       </w:r>
       <w:r>
         <w:rPr>
@@ -3035,7 +3035,7 @@
         <w:t xml:space="preserve">createRequestMessage</w:t>
       </w:r>
       <w:r>
-        <w:t xml:space="preserve"> issues no </w:t>
+        <w:t xml:space="preserve"> makes no </w:t>
       </w:r>
       <w:r>
         <w:rPr>
@@ -3044,7 +3044,7 @@
         <w:t xml:space="preserve">notify</w:t>
       </w:r>
       <w:r>
-        <w:t xml:space="preserve"> call and the push rules carry no owner-facing kind for a reply. The landlord-to-tenant direction already works.</w:t>
+        <w:t xml:space="preserve"> call, and the push rules have no owner-facing kind for a reply. The landlord-to-tenant direction already works.</w:t>
       </w:r>
     </w:p>
     <w:p>
@@ -3072,7 +3072,7 @@
         <w:t xml:space="preserve">.</w:t>
       </w:r>
       <w:r>
-        <w:t xml:space="preserve"> The landlord's own entry path inserts the payment and updates the due date as two separate statements. The tenant-facing </w:t>
+        <w:t xml:space="preserve"> The landlord's own entry path inserts the payment and updates the due date in two separate statements. </w:t>
       </w:r>
       <w:r>
         <w:rPr>
@@ -3081,7 +3081,7 @@
         <w:t xml:space="preserve">settlePayment</w:t>
       </w:r>
       <w:r>
-        <w:t xml:space="preserve"> is already transactional; this path is not, and a failure between the two leaves a payment recorded against a date that never moved.</w:t>
+        <w:t xml:space="preserve">, on the tenant-facing side, is already transactional. This path is not, and a failure between the two statements leaves a payment recorded against a date that never moved.</w:t>
       </w:r>
     </w:p>
     <w:p>
@@ -3094,7 +3094,7 @@
         <w:t xml:space="preserve">An automated test gate.</w:t>
       </w:r>
       <w:r>
-        <w:t xml:space="preserve"> The suites are reproducible and fast enough to run on every push; wiring them to CI is a configuration task, not a development one.</w:t>
+        <w:t xml:space="preserve"> The suites are reproducible and quick enough to run on every push. Wiring them into CI is configuration work rather than development work.</w:t>
       </w:r>
     </w:p>
     <w:p>
@@ -3125,10 +3125,10 @@
           <w:b/>
           <w:bCs/>
         </w:rPr>
-        <w:t xml:space="preserve">Split settlement, when there are landlords other than the author.</w:t>
-      </w:r>
-      <w:r>
-        <w:t xml:space="preserve"> Razorpay Route would let landlords onboard as linked sub-merchants inside the application, with the gateway performing their KYC — removing the onboarding friction named in Section 8. The cost is that funds would pass through a platform account, which is a category change rather than a configuration one, and the 2025 RBI directions restrict split settlement in ways that need professional advice rather than inference. Worth revisiting when the user base justifies it; not before.</w:t>
+        <w:t xml:space="preserve">Split settlement, once there are landlords other than the author.</w:t>
+      </w:r>
+      <w:r>
+        <w:t xml:space="preserve"> Razorpay Route would let landlords onboard as linked sub-merchants from inside the application, with the gateway doing their KYC. That would take away the onboarding friction described in Section 8. The cost is that funds would then pass through a platform account, which is a change of category and not of configuration, and the 2025 RBI directions restrict split settlement in ways that call for professional advice rather than inference. Worth coming back to when the user base justifies it. Not before.</w:t>
       </w:r>
     </w:p>
     <w:p>
@@ -3141,7 +3141,7 @@
         <w:t xml:space="preserve">Monetisation without entering the money path.</w:t>
       </w:r>
       <w:r>
-        <w:t xml:space="preserve"> The Namma Yatri precedent is directly applicable: a flat per-landlord subscription keeps the operator outside the payment flow entirely, where a per-transaction percentage structurally resembles aggregation. A related legal nuance is that such models rest on selling software access and not setting the price — and in TenantPro the landlord sets the rent, which is a position worth preserving deliberately.</w:t>
+        <w:t xml:space="preserve"> The Namma Yatri precedent applies here almost directly. A flat per-landlord subscription keeps the operator out of the payment flow altogether, whereas a percentage of each transaction starts to look structurally like aggregation. There is a related legal nuance: models like this rest on selling access to software rather than on setting the price. In TenantPro the landlord sets the rent, and that is a position worth holding on to deliberately.</w:t>
       </w:r>
     </w:p>
     <w:p>
@@ -3154,7 +3154,7 @@
         <w:t xml:space="preserve">Deliverability.</w:t>
       </w:r>
       <w:r>
-        <w:t xml:space="preserve"> Transactional mail currently sends from a Gmail address through Brevo's HTTPS API. A verified sending domain with SPF, DKIM and DMARC would materially improve inbox placement, at roughly ₹1,000 per year.</w:t>
+        <w:t xml:space="preserve"> Transactional mail goes out from a Gmail address through Brevo's HTTPS API. A verified sending domain with SPF, DKIM and DMARC would improve inbox placement a good deal, for somewhere around ₹1,000 a year.</w:t>
       </w:r>
     </w:p>
     <w:p>
@@ -3167,7 +3167,7 @@
         <w:t xml:space="preserve">SMS and DLT.</w:t>
       </w:r>
       <w:r>
-        <w:t xml:space="preserve"> Phone verification needs an Indian DLT registration before an operator will carry template traffic.</w:t>
+        <w:t xml:space="preserve"> Phone verification needs an Indian DLT registration before any operator will carry template traffic.</w:t>
       </w:r>
     </w:p>
     <w:p>
@@ -3180,7 +3180,7 @@
         <w:t xml:space="preserve">Landlord announcements.</w:t>
       </w:r>
       <w:r>
-        <w:t xml:space="preserve"> A one-to-many message to a property's tenants ("water off Tuesday") was specified during the notification work and never built; the alert infrastructure to carry it already exists.</w:t>
+        <w:t xml:space="preserve"> A one-to-many message to everyone in a property ("water off Tuesday") was specified during the notification work and then never built. The alert infrastructure that would carry it is already there.</w:t>
       </w:r>
     </w:p>
     <w:p>
@@ -3194,7 +3194,7 @@
     <w:p>
       <w:pPr/>
       <w:r>
-        <w:t xml:space="preserve">Code figures, endpoint counts and assertion totals in this report were measured directly from the repository at commit </w:t>
+        <w:t xml:space="preserve">The code figures, endpoint counts and assertion totals in this report were measured from the repository at commit </w:t>
       </w:r>
       <w:r>
         <w:rPr>
@@ -3203,7 +3203,7 @@
         <w:t xml:space="preserve">f065250</w:t>
       </w:r>
       <w:r>
-        <w:t xml:space="preserve"> and from live test runs, not estimated.</w:t>
+        <w:t xml:space="preserve"> and from live test runs. None of them are estimates.</w:t>
       </w:r>
     </w:p>
     <w:p>
@@ -3346,7 +3346,7 @@
         <w:t xml:space="preserve">Note on secondary sources.</w:t>
       </w:r>
       <w:r>
-        <w:t xml:space="preserve"> Several regulatory points above rest on consultancy and industry commentary rather than the RBI's own text. Where this report draws on them — particularly the net-worth thresholds and the restrictions on split settlement — the claims should be verified against the Directions themselves before any structuring decision is taken.</w:t>
+        <w:t xml:space="preserve"> Several of the regulatory points above rest on consultancy and industry commentary rather than on the RBI's own text. Where this report leans on them, particularly for the net-worth thresholds and the restrictions on split settlement, the claims should be checked against the Directions themselves before anybody makes a structuring decision.</w:t>
       </w:r>
     </w:p>
     <w:sectPr>

</xml_diff>